<commit_message>
Editor installation guide: Windows for scenario 1 (localhost) and scenario 2 (cloud / on prem)
- Scenario 1 on Windows 10/11: WSL 2 + Docker Desktop with the same scripts (recommended), or
  PowerShell without the scripts (rebuild and check the package, load the image, .env, start,
  licences, cslic as a PowerShell function, key folder restricted with icacls).
- Scenario 2 on Windows Server 2022/2025: Linux VM (recommended) or WSL 2 with Docker Engine,
  mirrored networking or netsh portproxy, firewall rule, start-up scheduled task.
- Windows prerequisites, troubleshooting rows and command reference.

Co-Authored-By: Claude Opus 5.5 <noreply@anthropic.com>
Claude-Session: https://claude.ai/code/session_01CPoP9gXznxAoCuDQx1kksH
</commit_message>
<xml_diff>
--- a/cortexskills/deliverables/CortexSkills_Guide_Installation_Client_Docker_FR.docx
+++ b/cortexskills/deliverables/CortexSkills_Guide_Installation_Client_Docker_FR.docx
@@ -225,7 +225,7 @@
             </w:rPr>
             <w:fldChar w:fldCharType="separate"/>
           </w:r>
-          <w:hyperlink w:anchor="__RefHeading___Toc750_641660197">
+          <w:hyperlink w:anchor="__RefHeading___Toc750_797318747">
             <w:r>
               <w:rPr>
                 <w:rStyle w:val="IndexLink"/>
@@ -245,7 +245,7 @@
             </w:tabs>
             <w:rPr/>
           </w:pPr>
-          <w:hyperlink w:anchor="__RefHeading___Toc752_641660197">
+          <w:hyperlink w:anchor="__RefHeading___Toc752_797318747">
             <w:r>
               <w:rPr>
                 <w:rStyle w:val="IndexLink"/>
@@ -265,7 +265,7 @@
             </w:tabs>
             <w:rPr/>
           </w:pPr>
-          <w:hyperlink w:anchor="__RefHeading___Toc754_641660197">
+          <w:hyperlink w:anchor="__RefHeading___Toc754_797318747">
             <w:r>
               <w:rPr>
                 <w:rStyle w:val="IndexLink"/>
@@ -285,7 +285,7 @@
             </w:tabs>
             <w:rPr/>
           </w:pPr>
-          <w:hyperlink w:anchor="__RefHeading___Toc756_641660197">
+          <w:hyperlink w:anchor="__RefHeading___Toc756_797318747">
             <w:r>
               <w:rPr>
                 <w:rStyle w:val="IndexLink"/>
@@ -305,7 +305,7 @@
             </w:tabs>
             <w:rPr/>
           </w:pPr>
-          <w:hyperlink w:anchor="__RefHeading___Toc758_641660197">
+          <w:hyperlink w:anchor="__RefHeading___Toc758_797318747">
             <w:r>
               <w:rPr>
                 <w:rStyle w:val="IndexLink"/>
@@ -325,7 +325,7 @@
             </w:tabs>
             <w:rPr/>
           </w:pPr>
-          <w:hyperlink w:anchor="__RefHeading___Toc760_641660197">
+          <w:hyperlink w:anchor="__RefHeading___Toc760_797318747">
             <w:r>
               <w:rPr>
                 <w:rStyle w:val="IndexLink"/>
@@ -345,7 +345,7 @@
             </w:tabs>
             <w:rPr/>
           </w:pPr>
-          <w:hyperlink w:anchor="__RefHeading___Toc762_641660197">
+          <w:hyperlink w:anchor="__RefHeading___Toc762_797318747">
             <w:r>
               <w:rPr>
                 <w:rStyle w:val="IndexLink"/>
@@ -365,7 +365,7 @@
             </w:tabs>
             <w:rPr/>
           </w:pPr>
-          <w:hyperlink w:anchor="__RefHeading___Toc764_641660197">
+          <w:hyperlink w:anchor="__RefHeading___Toc764_797318747">
             <w:r>
               <w:rPr>
                 <w:rStyle w:val="IndexLink"/>
@@ -385,7 +385,7 @@
             </w:tabs>
             <w:rPr/>
           </w:pPr>
-          <w:hyperlink w:anchor="__RefHeading___Toc766_641660197">
+          <w:hyperlink w:anchor="__RefHeading___Toc766_797318747">
             <w:r>
               <w:rPr>
                 <w:rStyle w:val="IndexLink"/>
@@ -405,7 +405,7 @@
             </w:tabs>
             <w:rPr/>
           </w:pPr>
-          <w:hyperlink w:anchor="__RefHeading___Toc768_641660197">
+          <w:hyperlink w:anchor="__RefHeading___Toc768_797318747">
             <w:r>
               <w:rPr>
                 <w:rStyle w:val="IndexLink"/>
@@ -425,7 +425,7 @@
             </w:tabs>
             <w:rPr/>
           </w:pPr>
-          <w:hyperlink w:anchor="__RefHeading___Toc770_641660197">
+          <w:hyperlink w:anchor="__RefHeading___Toc770_797318747">
             <w:r>
               <w:rPr>
                 <w:rStyle w:val="IndexLink"/>
@@ -445,7 +445,7 @@
             </w:tabs>
             <w:rPr/>
           </w:pPr>
-          <w:hyperlink w:anchor="__RefHeading___Toc772_641660197">
+          <w:hyperlink w:anchor="__RefHeading___Toc772_797318747">
             <w:r>
               <w:rPr>
                 <w:rStyle w:val="IndexLink"/>
@@ -465,7 +465,7 @@
             </w:tabs>
             <w:rPr/>
           </w:pPr>
-          <w:hyperlink w:anchor="__RefHeading___Toc774_641660197">
+          <w:hyperlink w:anchor="__RefHeading___Toc774_797318747">
             <w:r>
               <w:rPr>
                 <w:rStyle w:val="IndexLink"/>
@@ -485,7 +485,7 @@
             </w:tabs>
             <w:rPr/>
           </w:pPr>
-          <w:hyperlink w:anchor="__RefHeading___Toc776_641660197">
+          <w:hyperlink w:anchor="__RefHeading___Toc776_797318747">
             <w:r>
               <w:rPr>
                 <w:rStyle w:val="IndexLink"/>
@@ -505,7 +505,7 @@
             </w:tabs>
             <w:rPr/>
           </w:pPr>
-          <w:hyperlink w:anchor="__RefHeading___Toc778_641660197">
+          <w:hyperlink w:anchor="__RefHeading___Toc778_797318747">
             <w:r>
               <w:rPr>
                 <w:rStyle w:val="IndexLink"/>
@@ -525,7 +525,7 @@
             </w:tabs>
             <w:rPr/>
           </w:pPr>
-          <w:hyperlink w:anchor="__RefHeading___Toc780_641660197">
+          <w:hyperlink w:anchor="__RefHeading___Toc780_797318747">
             <w:r>
               <w:rPr>
                 <w:rStyle w:val="IndexLink"/>
@@ -545,7 +545,7 @@
             </w:tabs>
             <w:rPr/>
           </w:pPr>
-          <w:hyperlink w:anchor="__RefHeading___Toc782_641660197">
+          <w:hyperlink w:anchor="__RefHeading___Toc782_797318747">
             <w:r>
               <w:rPr>
                 <w:rStyle w:val="IndexLink"/>
@@ -565,7 +565,7 @@
             </w:tabs>
             <w:rPr/>
           </w:pPr>
-          <w:hyperlink w:anchor="__RefHeading___Toc784_641660197">
+          <w:hyperlink w:anchor="__RefHeading___Toc784_797318747">
             <w:r>
               <w:rPr>
                 <w:rStyle w:val="IndexLink"/>
@@ -585,7 +585,7 @@
             </w:tabs>
             <w:rPr/>
           </w:pPr>
-          <w:hyperlink w:anchor="__RefHeading___Toc786_641660197">
+          <w:hyperlink w:anchor="__RefHeading___Toc786_797318747">
             <w:r>
               <w:rPr>
                 <w:rStyle w:val="IndexLink"/>
@@ -605,7 +605,7 @@
             </w:tabs>
             <w:rPr/>
           </w:pPr>
-          <w:hyperlink w:anchor="__RefHeading___Toc788_641660197">
+          <w:hyperlink w:anchor="__RefHeading___Toc788_797318747">
             <w:r>
               <w:rPr>
                 <w:rStyle w:val="IndexLink"/>
@@ -625,7 +625,7 @@
             </w:tabs>
             <w:rPr/>
           </w:pPr>
-          <w:hyperlink w:anchor="__RefHeading___Toc790_641660197">
+          <w:hyperlink w:anchor="__RefHeading___Toc790_797318747">
             <w:r>
               <w:rPr>
                 <w:rStyle w:val="IndexLink"/>
@@ -645,7 +645,7 @@
             </w:tabs>
             <w:rPr/>
           </w:pPr>
-          <w:hyperlink w:anchor="__RefHeading___Toc792_641660197">
+          <w:hyperlink w:anchor="__RefHeading___Toc792_797318747">
             <w:r>
               <w:rPr>
                 <w:rStyle w:val="IndexLink"/>
@@ -665,7 +665,7 @@
             </w:tabs>
             <w:rPr/>
           </w:pPr>
-          <w:hyperlink w:anchor="__RefHeading___Toc794_641660197">
+          <w:hyperlink w:anchor="__RefHeading___Toc794_797318747">
             <w:r>
               <w:rPr>
                 <w:rStyle w:val="IndexLink"/>
@@ -685,7 +685,7 @@
             </w:tabs>
             <w:rPr/>
           </w:pPr>
-          <w:hyperlink w:anchor="__RefHeading___Toc796_641660197">
+          <w:hyperlink w:anchor="__RefHeading___Toc796_797318747">
             <w:r>
               <w:rPr>
                 <w:rStyle w:val="IndexLink"/>
@@ -729,7 +729,7 @@
         <w:spacing w:before="0" w:after="240"/>
         <w:rPr/>
       </w:pPr>
-      <w:bookmarkStart w:id="0" w:name="__RefHeading___Toc750_641660197"/>
+      <w:bookmarkStart w:id="0" w:name="__RefHeading___Toc750_797318747"/>
       <w:bookmarkEnd w:id="0"/>
       <w:r>
         <w:rPr>
@@ -1309,7 +1309,7 @@
       <w:r>
         <w:br w:type="page"/>
       </w:r>
-      <w:bookmarkStart w:id="1" w:name="__RefHeading___Toc752_641660197"/>
+      <w:bookmarkStart w:id="1" w:name="__RefHeading___Toc752_797318747"/>
       <w:bookmarkEnd w:id="1"/>
       <w:r>
         <w:rPr>
@@ -1330,7 +1330,7 @@
         <w:spacing w:before="320" w:after="120"/>
         <w:rPr/>
       </w:pPr>
-      <w:bookmarkStart w:id="2" w:name="__RefHeading___Toc754_641660197"/>
+      <w:bookmarkStart w:id="2" w:name="__RefHeading___Toc754_797318747"/>
       <w:bookmarkEnd w:id="2"/>
       <w:r>
         <w:rPr>
@@ -1941,7 +1941,7 @@
         <w:spacing w:before="320" w:after="120"/>
         <w:rPr/>
       </w:pPr>
-      <w:bookmarkStart w:id="3" w:name="__RefHeading___Toc756_641660197"/>
+      <w:bookmarkStart w:id="3" w:name="__RefHeading___Toc756_797318747"/>
       <w:bookmarkEnd w:id="3"/>
       <w:r>
         <w:rPr>
@@ -2371,7 +2371,7 @@
         <w:spacing w:before="320" w:after="120"/>
         <w:rPr/>
       </w:pPr>
-      <w:bookmarkStart w:id="4" w:name="__RefHeading___Toc758_641660197"/>
+      <w:bookmarkStart w:id="4" w:name="__RefHeading___Toc758_797318747"/>
       <w:bookmarkEnd w:id="4"/>
       <w:r>
         <w:rPr>
@@ -2871,7 +2871,7 @@
       <w:r>
         <w:br w:type="page"/>
       </w:r>
-      <w:bookmarkStart w:id="5" w:name="__RefHeading___Toc760_641660197"/>
+      <w:bookmarkStart w:id="5" w:name="__RefHeading___Toc760_797318747"/>
       <w:bookmarkEnd w:id="5"/>
       <w:r>
         <w:rPr>
@@ -3015,7 +3015,7 @@
         <w:spacing w:before="0" w:after="240"/>
         <w:rPr/>
       </w:pPr>
-      <w:bookmarkStart w:id="6" w:name="__RefHeading___Toc762_641660197"/>
+      <w:bookmarkStart w:id="6" w:name="__RefHeading___Toc762_797318747"/>
       <w:bookmarkEnd w:id="6"/>
       <w:r>
         <w:rPr>
@@ -3809,7 +3809,7 @@
       <w:r>
         <w:br w:type="page"/>
       </w:r>
-      <w:bookmarkStart w:id="7" w:name="__RefHeading___Toc764_641660197"/>
+      <w:bookmarkStart w:id="7" w:name="__RefHeading___Toc764_797318747"/>
       <w:bookmarkEnd w:id="7"/>
       <w:r>
         <w:rPr>
@@ -5227,7 +5227,7 @@
       <w:r>
         <w:br w:type="page"/>
       </w:r>
-      <w:bookmarkStart w:id="8" w:name="__RefHeading___Toc766_641660197"/>
+      <w:bookmarkStart w:id="8" w:name="__RefHeading___Toc766_797318747"/>
       <w:bookmarkEnd w:id="8"/>
       <w:r>
         <w:rPr>
@@ -5982,7 +5982,7 @@
         <w:spacing w:before="0" w:after="240"/>
         <w:rPr/>
       </w:pPr>
-      <w:bookmarkStart w:id="9" w:name="__RefHeading___Toc768_641660197"/>
+      <w:bookmarkStart w:id="9" w:name="__RefHeading___Toc768_797318747"/>
       <w:bookmarkEnd w:id="9"/>
       <w:r>
         <w:rPr>
@@ -6257,7 +6257,7 @@
         <w:spacing w:before="0" w:after="240"/>
         <w:rPr/>
       </w:pPr>
-      <w:bookmarkStart w:id="10" w:name="__RefHeading___Toc770_641660197"/>
+      <w:bookmarkStart w:id="10" w:name="__RefHeading___Toc770_797318747"/>
       <w:bookmarkEnd w:id="10"/>
       <w:r>
         <w:rPr>
@@ -6837,7 +6837,7 @@
         <w:spacing w:before="0" w:after="240"/>
         <w:rPr/>
       </w:pPr>
-      <w:bookmarkStart w:id="11" w:name="__RefHeading___Toc772_641660197"/>
+      <w:bookmarkStart w:id="11" w:name="__RefHeading___Toc772_797318747"/>
       <w:bookmarkEnd w:id="11"/>
       <w:r>
         <w:rPr>
@@ -7168,7 +7168,7 @@
         <w:spacing w:before="320" w:after="120"/>
         <w:rPr/>
       </w:pPr>
-      <w:bookmarkStart w:id="12" w:name="__RefHeading___Toc774_641660197"/>
+      <w:bookmarkStart w:id="12" w:name="__RefHeading___Toc774_797318747"/>
       <w:bookmarkEnd w:id="12"/>
       <w:r>
         <w:rPr>
@@ -7231,7 +7231,7 @@
         <w:spacing w:before="320" w:after="120"/>
         <w:rPr/>
       </w:pPr>
-      <w:bookmarkStart w:id="13" w:name="__RefHeading___Toc776_641660197"/>
+      <w:bookmarkStart w:id="13" w:name="__RefHeading___Toc776_797318747"/>
       <w:bookmarkEnd w:id="13"/>
       <w:r>
         <w:rPr>
@@ -7337,7 +7337,7 @@
         <w:spacing w:before="320" w:after="120"/>
         <w:rPr/>
       </w:pPr>
-      <w:bookmarkStart w:id="14" w:name="__RefHeading___Toc778_641660197"/>
+      <w:bookmarkStart w:id="14" w:name="__RefHeading___Toc778_797318747"/>
       <w:bookmarkEnd w:id="14"/>
       <w:r>
         <w:rPr>
@@ -7423,7 +7423,7 @@
         <w:spacing w:before="0" w:after="240"/>
         <w:rPr/>
       </w:pPr>
-      <w:bookmarkStart w:id="15" w:name="__RefHeading___Toc780_641660197"/>
+      <w:bookmarkStart w:id="15" w:name="__RefHeading___Toc780_797318747"/>
       <w:bookmarkEnd w:id="15"/>
       <w:r>
         <w:rPr>
@@ -7444,7 +7444,7 @@
         <w:spacing w:before="320" w:after="120"/>
         <w:rPr/>
       </w:pPr>
-      <w:bookmarkStart w:id="16" w:name="__RefHeading___Toc782_641660197"/>
+      <w:bookmarkStart w:id="16" w:name="__RefHeading___Toc782_797318747"/>
       <w:bookmarkEnd w:id="16"/>
       <w:r>
         <w:rPr>
@@ -7891,7 +7891,7 @@
         <w:spacing w:before="320" w:after="120"/>
         <w:rPr/>
       </w:pPr>
-      <w:bookmarkStart w:id="17" w:name="__RefHeading___Toc784_641660197"/>
+      <w:bookmarkStart w:id="17" w:name="__RefHeading___Toc784_797318747"/>
       <w:bookmarkEnd w:id="17"/>
       <w:r>
         <w:rPr>
@@ -8013,7 +8013,7 @@
         <w:spacing w:before="320" w:after="120"/>
         <w:rPr/>
       </w:pPr>
-      <w:bookmarkStart w:id="18" w:name="__RefHeading___Toc786_641660197"/>
+      <w:bookmarkStart w:id="18" w:name="__RefHeading___Toc786_797318747"/>
       <w:bookmarkEnd w:id="18"/>
       <w:r>
         <w:rPr>
@@ -8135,7 +8135,7 @@
         <w:spacing w:before="320" w:after="120"/>
         <w:rPr/>
       </w:pPr>
-      <w:bookmarkStart w:id="19" w:name="__RefHeading___Toc788_641660197"/>
+      <w:bookmarkStart w:id="19" w:name="__RefHeading___Toc788_797318747"/>
       <w:bookmarkEnd w:id="19"/>
       <w:r>
         <w:rPr>
@@ -8261,7 +8261,7 @@
         <w:spacing w:before="320" w:after="120"/>
         <w:rPr/>
       </w:pPr>
-      <w:bookmarkStart w:id="20" w:name="__RefHeading___Toc790_641660197"/>
+      <w:bookmarkStart w:id="20" w:name="__RefHeading___Toc790_797318747"/>
       <w:bookmarkEnd w:id="20"/>
       <w:r>
         <w:rPr>
@@ -8304,7 +8304,7 @@
         <w:spacing w:before="0" w:after="240"/>
         <w:rPr/>
       </w:pPr>
-      <w:bookmarkStart w:id="21" w:name="__RefHeading___Toc792_641660197"/>
+      <w:bookmarkStart w:id="21" w:name="__RefHeading___Toc792_797318747"/>
       <w:bookmarkEnd w:id="21"/>
       <w:r>
         <w:rPr>
@@ -8430,7 +8430,7 @@
         <w:spacing w:before="0" w:after="240"/>
         <w:rPr/>
       </w:pPr>
-      <w:bookmarkStart w:id="22" w:name="__RefHeading___Toc794_641660197"/>
+      <w:bookmarkStart w:id="22" w:name="__RefHeading___Toc794_797318747"/>
       <w:bookmarkEnd w:id="22"/>
       <w:r>
         <w:rPr>
@@ -9616,7 +9616,7 @@
       <w:r>
         <w:br w:type="page"/>
       </w:r>
-      <w:bookmarkStart w:id="23" w:name="__RefHeading___Toc796_641660197"/>
+      <w:bookmarkStart w:id="23" w:name="__RefHeading___Toc796_797318747"/>
       <w:bookmarkEnd w:id="23"/>
       <w:r>
         <w:rPr>

</xml_diff>

<commit_message>
Split the editor installation guide into Linux and Windows guides
Two Word guides with TOC (and PDFs) replace the combined editor guide:
CortexSkills_Guide_Installation_Editeur_Linux_Docker_FR and
CortexSkills_Guide_Installation_Editeur_Windows_Docker_FR, built from
shared blocks (signing station, server install, operations, licence CRUD).

Co-Authored-By: Claude Opus 5.5 <noreply@anthropic.com>
Claude-Session: https://claude.ai/code/session_01CPoP9gXznxAoCuDQx1kksH
</commit_message>
<xml_diff>
--- a/cortexskills/deliverables/CortexSkills_Guide_Installation_Client_Docker_FR.docx
+++ b/cortexskills/deliverables/CortexSkills_Guide_Installation_Client_Docker_FR.docx
@@ -225,7 +225,7 @@
             </w:rPr>
             <w:fldChar w:fldCharType="separate"/>
           </w:r>
-          <w:hyperlink w:anchor="__RefHeading___Toc750_797318747">
+          <w:hyperlink w:anchor="__RefHeading___Toc2684_3891775436">
             <w:r>
               <w:rPr>
                 <w:rStyle w:val="IndexLink"/>
@@ -245,7 +245,7 @@
             </w:tabs>
             <w:rPr/>
           </w:pPr>
-          <w:hyperlink w:anchor="__RefHeading___Toc752_797318747">
+          <w:hyperlink w:anchor="__RefHeading___Toc2686_3891775436">
             <w:r>
               <w:rPr>
                 <w:rStyle w:val="IndexLink"/>
@@ -265,7 +265,7 @@
             </w:tabs>
             <w:rPr/>
           </w:pPr>
-          <w:hyperlink w:anchor="__RefHeading___Toc754_797318747">
+          <w:hyperlink w:anchor="__RefHeading___Toc2688_3891775436">
             <w:r>
               <w:rPr>
                 <w:rStyle w:val="IndexLink"/>
@@ -285,7 +285,7 @@
             </w:tabs>
             <w:rPr/>
           </w:pPr>
-          <w:hyperlink w:anchor="__RefHeading___Toc756_797318747">
+          <w:hyperlink w:anchor="__RefHeading___Toc2690_3891775436">
             <w:r>
               <w:rPr>
                 <w:rStyle w:val="IndexLink"/>
@@ -305,7 +305,7 @@
             </w:tabs>
             <w:rPr/>
           </w:pPr>
-          <w:hyperlink w:anchor="__RefHeading___Toc758_797318747">
+          <w:hyperlink w:anchor="__RefHeading___Toc2692_3891775436">
             <w:r>
               <w:rPr>
                 <w:rStyle w:val="IndexLink"/>
@@ -325,7 +325,7 @@
             </w:tabs>
             <w:rPr/>
           </w:pPr>
-          <w:hyperlink w:anchor="__RefHeading___Toc760_797318747">
+          <w:hyperlink w:anchor="__RefHeading___Toc2694_3891775436">
             <w:r>
               <w:rPr>
                 <w:rStyle w:val="IndexLink"/>
@@ -345,7 +345,7 @@
             </w:tabs>
             <w:rPr/>
           </w:pPr>
-          <w:hyperlink w:anchor="__RefHeading___Toc762_797318747">
+          <w:hyperlink w:anchor="__RefHeading___Toc2696_3891775436">
             <w:r>
               <w:rPr>
                 <w:rStyle w:val="IndexLink"/>
@@ -365,7 +365,7 @@
             </w:tabs>
             <w:rPr/>
           </w:pPr>
-          <w:hyperlink w:anchor="__RefHeading___Toc764_797318747">
+          <w:hyperlink w:anchor="__RefHeading___Toc2698_3891775436">
             <w:r>
               <w:rPr>
                 <w:rStyle w:val="IndexLink"/>
@@ -385,7 +385,7 @@
             </w:tabs>
             <w:rPr/>
           </w:pPr>
-          <w:hyperlink w:anchor="__RefHeading___Toc766_797318747">
+          <w:hyperlink w:anchor="__RefHeading___Toc2700_3891775436">
             <w:r>
               <w:rPr>
                 <w:rStyle w:val="IndexLink"/>
@@ -405,7 +405,7 @@
             </w:tabs>
             <w:rPr/>
           </w:pPr>
-          <w:hyperlink w:anchor="__RefHeading___Toc768_797318747">
+          <w:hyperlink w:anchor="__RefHeading___Toc2702_3891775436">
             <w:r>
               <w:rPr>
                 <w:rStyle w:val="IndexLink"/>
@@ -425,7 +425,7 @@
             </w:tabs>
             <w:rPr/>
           </w:pPr>
-          <w:hyperlink w:anchor="__RefHeading___Toc770_797318747">
+          <w:hyperlink w:anchor="__RefHeading___Toc2704_3891775436">
             <w:r>
               <w:rPr>
                 <w:rStyle w:val="IndexLink"/>
@@ -445,7 +445,7 @@
             </w:tabs>
             <w:rPr/>
           </w:pPr>
-          <w:hyperlink w:anchor="__RefHeading___Toc772_797318747">
+          <w:hyperlink w:anchor="__RefHeading___Toc2706_3891775436">
             <w:r>
               <w:rPr>
                 <w:rStyle w:val="IndexLink"/>
@@ -465,7 +465,7 @@
             </w:tabs>
             <w:rPr/>
           </w:pPr>
-          <w:hyperlink w:anchor="__RefHeading___Toc774_797318747">
+          <w:hyperlink w:anchor="__RefHeading___Toc2708_3891775436">
             <w:r>
               <w:rPr>
                 <w:rStyle w:val="IndexLink"/>
@@ -485,7 +485,7 @@
             </w:tabs>
             <w:rPr/>
           </w:pPr>
-          <w:hyperlink w:anchor="__RefHeading___Toc776_797318747">
+          <w:hyperlink w:anchor="__RefHeading___Toc2710_3891775436">
             <w:r>
               <w:rPr>
                 <w:rStyle w:val="IndexLink"/>
@@ -505,7 +505,7 @@
             </w:tabs>
             <w:rPr/>
           </w:pPr>
-          <w:hyperlink w:anchor="__RefHeading___Toc778_797318747">
+          <w:hyperlink w:anchor="__RefHeading___Toc2712_3891775436">
             <w:r>
               <w:rPr>
                 <w:rStyle w:val="IndexLink"/>
@@ -525,7 +525,7 @@
             </w:tabs>
             <w:rPr/>
           </w:pPr>
-          <w:hyperlink w:anchor="__RefHeading___Toc780_797318747">
+          <w:hyperlink w:anchor="__RefHeading___Toc2714_3891775436">
             <w:r>
               <w:rPr>
                 <w:rStyle w:val="IndexLink"/>
@@ -545,7 +545,7 @@
             </w:tabs>
             <w:rPr/>
           </w:pPr>
-          <w:hyperlink w:anchor="__RefHeading___Toc782_797318747">
+          <w:hyperlink w:anchor="__RefHeading___Toc2716_3891775436">
             <w:r>
               <w:rPr>
                 <w:rStyle w:val="IndexLink"/>
@@ -565,7 +565,7 @@
             </w:tabs>
             <w:rPr/>
           </w:pPr>
-          <w:hyperlink w:anchor="__RefHeading___Toc784_797318747">
+          <w:hyperlink w:anchor="__RefHeading___Toc2718_3891775436">
             <w:r>
               <w:rPr>
                 <w:rStyle w:val="IndexLink"/>
@@ -585,7 +585,7 @@
             </w:tabs>
             <w:rPr/>
           </w:pPr>
-          <w:hyperlink w:anchor="__RefHeading___Toc786_797318747">
+          <w:hyperlink w:anchor="__RefHeading___Toc2720_3891775436">
             <w:r>
               <w:rPr>
                 <w:rStyle w:val="IndexLink"/>
@@ -605,7 +605,7 @@
             </w:tabs>
             <w:rPr/>
           </w:pPr>
-          <w:hyperlink w:anchor="__RefHeading___Toc788_797318747">
+          <w:hyperlink w:anchor="__RefHeading___Toc2722_3891775436">
             <w:r>
               <w:rPr>
                 <w:rStyle w:val="IndexLink"/>
@@ -625,7 +625,7 @@
             </w:tabs>
             <w:rPr/>
           </w:pPr>
-          <w:hyperlink w:anchor="__RefHeading___Toc790_797318747">
+          <w:hyperlink w:anchor="__RefHeading___Toc2724_3891775436">
             <w:r>
               <w:rPr>
                 <w:rStyle w:val="IndexLink"/>
@@ -645,7 +645,7 @@
             </w:tabs>
             <w:rPr/>
           </w:pPr>
-          <w:hyperlink w:anchor="__RefHeading___Toc792_797318747">
+          <w:hyperlink w:anchor="__RefHeading___Toc2726_3891775436">
             <w:r>
               <w:rPr>
                 <w:rStyle w:val="IndexLink"/>
@@ -665,7 +665,7 @@
             </w:tabs>
             <w:rPr/>
           </w:pPr>
-          <w:hyperlink w:anchor="__RefHeading___Toc794_797318747">
+          <w:hyperlink w:anchor="__RefHeading___Toc2728_3891775436">
             <w:r>
               <w:rPr>
                 <w:rStyle w:val="IndexLink"/>
@@ -685,7 +685,7 @@
             </w:tabs>
             <w:rPr/>
           </w:pPr>
-          <w:hyperlink w:anchor="__RefHeading___Toc796_797318747">
+          <w:hyperlink w:anchor="__RefHeading___Toc2730_3891775436">
             <w:r>
               <w:rPr>
                 <w:rStyle w:val="IndexLink"/>
@@ -729,7 +729,7 @@
         <w:spacing w:before="0" w:after="240"/>
         <w:rPr/>
       </w:pPr>
-      <w:bookmarkStart w:id="0" w:name="__RefHeading___Toc750_797318747"/>
+      <w:bookmarkStart w:id="0" w:name="__RefHeading___Toc2684_3891775436"/>
       <w:bookmarkEnd w:id="0"/>
       <w:r>
         <w:rPr>
@@ -1309,7 +1309,7 @@
       <w:r>
         <w:br w:type="page"/>
       </w:r>
-      <w:bookmarkStart w:id="1" w:name="__RefHeading___Toc752_797318747"/>
+      <w:bookmarkStart w:id="1" w:name="__RefHeading___Toc2686_3891775436"/>
       <w:bookmarkEnd w:id="1"/>
       <w:r>
         <w:rPr>
@@ -1330,7 +1330,7 @@
         <w:spacing w:before="320" w:after="120"/>
         <w:rPr/>
       </w:pPr>
-      <w:bookmarkStart w:id="2" w:name="__RefHeading___Toc754_797318747"/>
+      <w:bookmarkStart w:id="2" w:name="__RefHeading___Toc2688_3891775436"/>
       <w:bookmarkEnd w:id="2"/>
       <w:r>
         <w:rPr>
@@ -1941,7 +1941,7 @@
         <w:spacing w:before="320" w:after="120"/>
         <w:rPr/>
       </w:pPr>
-      <w:bookmarkStart w:id="3" w:name="__RefHeading___Toc756_797318747"/>
+      <w:bookmarkStart w:id="3" w:name="__RefHeading___Toc2690_3891775436"/>
       <w:bookmarkEnd w:id="3"/>
       <w:r>
         <w:rPr>
@@ -2371,7 +2371,7 @@
         <w:spacing w:before="320" w:after="120"/>
         <w:rPr/>
       </w:pPr>
-      <w:bookmarkStart w:id="4" w:name="__RefHeading___Toc758_797318747"/>
+      <w:bookmarkStart w:id="4" w:name="__RefHeading___Toc2692_3891775436"/>
       <w:bookmarkEnd w:id="4"/>
       <w:r>
         <w:rPr>
@@ -2871,7 +2871,7 @@
       <w:r>
         <w:br w:type="page"/>
       </w:r>
-      <w:bookmarkStart w:id="5" w:name="__RefHeading___Toc760_797318747"/>
+      <w:bookmarkStart w:id="5" w:name="__RefHeading___Toc2694_3891775436"/>
       <w:bookmarkEnd w:id="5"/>
       <w:r>
         <w:rPr>
@@ -3015,7 +3015,7 @@
         <w:spacing w:before="0" w:after="240"/>
         <w:rPr/>
       </w:pPr>
-      <w:bookmarkStart w:id="6" w:name="__RefHeading___Toc762_797318747"/>
+      <w:bookmarkStart w:id="6" w:name="__RefHeading___Toc2696_3891775436"/>
       <w:bookmarkEnd w:id="6"/>
       <w:r>
         <w:rPr>
@@ -3809,7 +3809,7 @@
       <w:r>
         <w:br w:type="page"/>
       </w:r>
-      <w:bookmarkStart w:id="7" w:name="__RefHeading___Toc764_797318747"/>
+      <w:bookmarkStart w:id="7" w:name="__RefHeading___Toc2698_3891775436"/>
       <w:bookmarkEnd w:id="7"/>
       <w:r>
         <w:rPr>
@@ -5227,7 +5227,7 @@
       <w:r>
         <w:br w:type="page"/>
       </w:r>
-      <w:bookmarkStart w:id="8" w:name="__RefHeading___Toc766_797318747"/>
+      <w:bookmarkStart w:id="8" w:name="__RefHeading___Toc2700_3891775436"/>
       <w:bookmarkEnd w:id="8"/>
       <w:r>
         <w:rPr>
@@ -5982,7 +5982,7 @@
         <w:spacing w:before="0" w:after="240"/>
         <w:rPr/>
       </w:pPr>
-      <w:bookmarkStart w:id="9" w:name="__RefHeading___Toc768_797318747"/>
+      <w:bookmarkStart w:id="9" w:name="__RefHeading___Toc2702_3891775436"/>
       <w:bookmarkEnd w:id="9"/>
       <w:r>
         <w:rPr>
@@ -6257,7 +6257,7 @@
         <w:spacing w:before="0" w:after="240"/>
         <w:rPr/>
       </w:pPr>
-      <w:bookmarkStart w:id="10" w:name="__RefHeading___Toc770_797318747"/>
+      <w:bookmarkStart w:id="10" w:name="__RefHeading___Toc2704_3891775436"/>
       <w:bookmarkEnd w:id="10"/>
       <w:r>
         <w:rPr>
@@ -6837,7 +6837,7 @@
         <w:spacing w:before="0" w:after="240"/>
         <w:rPr/>
       </w:pPr>
-      <w:bookmarkStart w:id="11" w:name="__RefHeading___Toc772_797318747"/>
+      <w:bookmarkStart w:id="11" w:name="__RefHeading___Toc2706_3891775436"/>
       <w:bookmarkEnd w:id="11"/>
       <w:r>
         <w:rPr>
@@ -7168,7 +7168,7 @@
         <w:spacing w:before="320" w:after="120"/>
         <w:rPr/>
       </w:pPr>
-      <w:bookmarkStart w:id="12" w:name="__RefHeading___Toc774_797318747"/>
+      <w:bookmarkStart w:id="12" w:name="__RefHeading___Toc2708_3891775436"/>
       <w:bookmarkEnd w:id="12"/>
       <w:r>
         <w:rPr>
@@ -7231,7 +7231,7 @@
         <w:spacing w:before="320" w:after="120"/>
         <w:rPr/>
       </w:pPr>
-      <w:bookmarkStart w:id="13" w:name="__RefHeading___Toc776_797318747"/>
+      <w:bookmarkStart w:id="13" w:name="__RefHeading___Toc2710_3891775436"/>
       <w:bookmarkEnd w:id="13"/>
       <w:r>
         <w:rPr>
@@ -7337,7 +7337,7 @@
         <w:spacing w:before="320" w:after="120"/>
         <w:rPr/>
       </w:pPr>
-      <w:bookmarkStart w:id="14" w:name="__RefHeading___Toc778_797318747"/>
+      <w:bookmarkStart w:id="14" w:name="__RefHeading___Toc2712_3891775436"/>
       <w:bookmarkEnd w:id="14"/>
       <w:r>
         <w:rPr>
@@ -7423,7 +7423,7 @@
         <w:spacing w:before="0" w:after="240"/>
         <w:rPr/>
       </w:pPr>
-      <w:bookmarkStart w:id="15" w:name="__RefHeading___Toc780_797318747"/>
+      <w:bookmarkStart w:id="15" w:name="__RefHeading___Toc2714_3891775436"/>
       <w:bookmarkEnd w:id="15"/>
       <w:r>
         <w:rPr>
@@ -7444,7 +7444,7 @@
         <w:spacing w:before="320" w:after="120"/>
         <w:rPr/>
       </w:pPr>
-      <w:bookmarkStart w:id="16" w:name="__RefHeading___Toc782_797318747"/>
+      <w:bookmarkStart w:id="16" w:name="__RefHeading___Toc2716_3891775436"/>
       <w:bookmarkEnd w:id="16"/>
       <w:r>
         <w:rPr>
@@ -7891,7 +7891,7 @@
         <w:spacing w:before="320" w:after="120"/>
         <w:rPr/>
       </w:pPr>
-      <w:bookmarkStart w:id="17" w:name="__RefHeading___Toc784_797318747"/>
+      <w:bookmarkStart w:id="17" w:name="__RefHeading___Toc2718_3891775436"/>
       <w:bookmarkEnd w:id="17"/>
       <w:r>
         <w:rPr>
@@ -8013,7 +8013,7 @@
         <w:spacing w:before="320" w:after="120"/>
         <w:rPr/>
       </w:pPr>
-      <w:bookmarkStart w:id="18" w:name="__RefHeading___Toc786_797318747"/>
+      <w:bookmarkStart w:id="18" w:name="__RefHeading___Toc2720_3891775436"/>
       <w:bookmarkEnd w:id="18"/>
       <w:r>
         <w:rPr>
@@ -8135,7 +8135,7 @@
         <w:spacing w:before="320" w:after="120"/>
         <w:rPr/>
       </w:pPr>
-      <w:bookmarkStart w:id="19" w:name="__RefHeading___Toc788_797318747"/>
+      <w:bookmarkStart w:id="19" w:name="__RefHeading___Toc2722_3891775436"/>
       <w:bookmarkEnd w:id="19"/>
       <w:r>
         <w:rPr>
@@ -8261,7 +8261,7 @@
         <w:spacing w:before="320" w:after="120"/>
         <w:rPr/>
       </w:pPr>
-      <w:bookmarkStart w:id="20" w:name="__RefHeading___Toc790_797318747"/>
+      <w:bookmarkStart w:id="20" w:name="__RefHeading___Toc2724_3891775436"/>
       <w:bookmarkEnd w:id="20"/>
       <w:r>
         <w:rPr>
@@ -8304,7 +8304,7 @@
         <w:spacing w:before="0" w:after="240"/>
         <w:rPr/>
       </w:pPr>
-      <w:bookmarkStart w:id="21" w:name="__RefHeading___Toc792_797318747"/>
+      <w:bookmarkStart w:id="21" w:name="__RefHeading___Toc2726_3891775436"/>
       <w:bookmarkEnd w:id="21"/>
       <w:r>
         <w:rPr>
@@ -8430,7 +8430,7 @@
         <w:spacing w:before="0" w:after="240"/>
         <w:rPr/>
       </w:pPr>
-      <w:bookmarkStart w:id="22" w:name="__RefHeading___Toc794_797318747"/>
+      <w:bookmarkStart w:id="22" w:name="__RefHeading___Toc2728_3891775436"/>
       <w:bookmarkEnd w:id="22"/>
       <w:r>
         <w:rPr>
@@ -9616,7 +9616,7 @@
       <w:r>
         <w:br w:type="page"/>
       </w:r>
-      <w:bookmarkStart w:id="23" w:name="__RefHeading___Toc796_797318747"/>
+      <w:bookmarkStart w:id="23" w:name="__RefHeading___Toc2730_3891775436"/>
       <w:bookmarkEnd w:id="23"/>
       <w:r>
         <w:rPr>

</xml_diff>